<commit_message>
Update user manual to version 1.0
Co-Authored-By: Claude Opus 5.5 <noreply@anthropic.com>
</commit_message>
<xml_diff>
--- a/docs/PackBox-Studio-User-Manual.docx
+++ b/docs/PackBox-Studio-User-Manual.docx
@@ -20,7 +20,7 @@
           <w:b/>
           <w:bCs/>
         </w:rPr>
-        <w:t xml:space="preserve">Version 0.1.0 · August 2026</w:t>
+        <w:t xml:space="preserve">Version 1.0 · August 2026</w:t>
       </w:r>
     </w:p>
     <w:p>
@@ -12499,7 +12499,7 @@
           <w:i/>
           <w:iCs/>
         </w:rPr>
-        <w:t xml:space="preserve">PackBox Studio 0.1.0 — built with React, Three.js and Konva, wrapped in Electron. Your designs stay on your computer.</w:t>
+        <w:t xml:space="preserve">PackBox Studio 1.0 — built with React, Three.js and Konva, wrapped in Electron. Your designs stay on your computer.</w:t>
       </w:r>
     </w:p>
     <w:sectPr>

</xml_diff>